<commit_message>
Convert Problem Statement and Vision to paragraph format
Co-authored-by: demodolly <demodolly@users.noreply.github.com>
</commit_message>
<xml_diff>
--- a/CTT Request Portal Decommission - Master BRD.docx
+++ b/CTT Request Portal Decommission - Master BRD.docx
@@ -448,43 +448,9 @@
       </w:r>
     </w:p>
     <w:p>
-      <w:pPr>
-        <w:pStyle w:val="ListBullet"/>
-      </w:pPr>
-      <w:r>
-        <w:t>The CTT Request Portal (cdc-tools.cisco.com) is on a platform scheduled for decommission with no dedicated product ownership or sustainment capacity.</w:t>
-      </w:r>
-    </w:p>
-    <w:p>
-      <w:pPr>
-        <w:pStyle w:val="ListBullet"/>
-      </w:pPr>
-      <w:r>
-        <w:t>Request fulfilment currently depends on Web Engineering resources, which may not align with marketing intake priorities.</w:t>
-      </w:r>
-    </w:p>
-    <w:p>
-      <w:pPr>
-        <w:pStyle w:val="ListBullet"/>
-      </w:pPr>
-      <w:r>
-        <w:t>Marketing teams use multiple entry points for identifier creation, increasing friction and inconsistent data capture.</w:t>
-      </w:r>
-    </w:p>
-    <w:p>
-      <w:pPr>
-        <w:pStyle w:val="ListBullet"/>
-      </w:pPr>
-      <w:r>
-        <w:t>Reporting and analytics teams require consistent, complete strategic metadata aligned to campaign hierarchy regardless of intake path.</w:t>
-      </w:r>
-    </w:p>
-    <w:p>
-      <w:pPr>
-        <w:pStyle w:val="ListBullet"/>
-      </w:pPr>
-      <w:r>
-        <w:t>The organisation is transitioning from legacy identifiers (Activity ID, Offer ID) toward Workfront-native identifiers (Channel ID, Content ID); intake must not create a dead-end when the CTT Tool is fully decommissioned.</w:t>
+      <w:pPr/>
+      <w:r>
+        <w:t>The CTT Request Portal (cdc-tools.cisco.com) is hosted on infrastructure scheduled for decommission, with no dedicated product ownership or sustainment capacity. Request fulfilment currently depends on Web Engineering resources, which may not align with marketing intake priorities. Marketing teams therefore use multiple entry points for identifier creation, increasing friction and leading to inconsistent data capture. Reporting and analytics teams require consistent, complete strategic metadata aligned to the campaign hierarchy regardless of intake path. At the same time, the organisation is transitioning from legacy identifiers (Activity ID, Offer ID) toward Workfront-native identifiers (Channel ID, Content ID), and intake must not create a dead-end when the CTT Tool is fully decommissioned.</w:t>
       </w:r>
     </w:p>
     <w:p>
@@ -496,43 +462,9 @@
       </w:r>
     </w:p>
     <w:p>
-      <w:pPr>
-        <w:pStyle w:val="ListBullet"/>
-      </w:pPr>
-      <w:r>
-        <w:t>A single supported intake experience for Campaign Tagging and Tracking identifier requests, integrated into the marketing operations workflow used by teams today.</w:t>
-      </w:r>
-    </w:p>
-    <w:p>
-      <w:pPr>
-        <w:pStyle w:val="ListBullet"/>
-      </w:pPr>
-      <w:r>
-        <w:t>Clear guidance for requesters on when identifiers are created automatically (e.g., as part of a marketing project workflow) versus when a standalone request is required.</w:t>
-      </w:r>
-    </w:p>
-    <w:p>
-      <w:pPr>
-        <w:pStyle w:val="ListBullet"/>
-      </w:pPr>
-      <w:r>
-        <w:t>Continued ability to request legacy identifiers (Activity ID, Offer ID) during the hybrid tracking period (FY27 and beyond as needed).</w:t>
-      </w:r>
-    </w:p>
-    <w:p>
-      <w:pPr>
-        <w:pStyle w:val="ListBullet"/>
-      </w:pPr>
-      <w:r>
-        <w:t>A requirements foundation that can be extended for Offer ID intake (companion section/document) and for future Workfront Channel and Content ID intake after CTT Tool decommission (companion document).</w:t>
-      </w:r>
-    </w:p>
-    <w:p>
-      <w:pPr>
-        <w:pStyle w:val="ListBullet"/>
-      </w:pPr>
-      <w:r>
-        <w:t>Consistent capture of strategic metadata (campaign hierarchy, stakeholder, funnel, region, etc.) to support reporting, attribution, and governance.</w:t>
+      <w:pPr/>
+      <w:r>
+        <w:t>The business requires a single supported intake experience for Campaign Tagging and Tracking identifier requests, integrated into the marketing operations workflow teams use today. Requesters must receive clear guidance on when identifiers are created automatically—for example, as part of a Workfront marketing project workflow—versus when a standalone request is required. During the hybrid tracking period (FY27 and beyond as needed), teams must retain the ability to request legacy identifiers (Activity ID, Offer ID). This Master BRD also establishes a requirements foundation that can be extended for Offer ID intake and, in a companion document, for Workfront Channel and Content ID intake after CTT Tool decommission. Across all identifier types, strategic metadata (campaign hierarchy, stakeholder, funnel stage, region, and related fields) must be captured consistently to support reporting, attribution, and governance.</w:t>
       </w:r>
     </w:p>
     <w:p>

</xml_diff>

<commit_message>
Update requirement codes to CCID and OID
Co-authored-by: demodolly <demodolly@users.noreply.github.com>
</commit_message>
<xml_diff>
--- a/CTT Request Portal Decommission - Master BRD.docx
+++ b/CTT Request Portal Decommission - Master BRD.docx
@@ -1095,7 +1095,7 @@
     </w:p>
     <w:p>
       <w:r>
-        <w:t>Requirements are expressed as business needs. Requirement IDs use the prefix REQ-CTT-WF. Detailed Activity ID field logic is maintained in the companion document: "CTT Request Portal move to Workfront - Activity ID.docx". Offer ID and future Channel/Content ID requirements will be added via BRD amendment or companion documents.</w:t>
+        <w:t>Requirements are expressed as business needs. Requirement codes CCID and OID identify changes needed to support Activity ID and Offer ID respectively. Detailed Activity ID field logic is maintained in the companion document: "CTT Request Portal move to Workfront - Activity ID.docx". Offer ID and future Channel/Content ID requirements will be added via BRD amendment or companion documents.</w:t>
       </w:r>
     </w:p>
     <w:p>
@@ -1124,7 +1124,7 @@
           </w:tcPr>
           <w:p>
             <w:r>
-              <w:t>Stakeholder</w:t>
+              <w:t>Code</w:t>
             </w:r>
           </w:p>
         </w:tc>
@@ -1134,7 +1134,7 @@
           </w:tcPr>
           <w:p>
             <w:r>
-              <w:t>Code Prefix</w:t>
+              <w:t>Identifier Type</w:t>
             </w:r>
           </w:p>
         </w:tc>
@@ -1156,7 +1156,7 @@
           </w:tcPr>
           <w:p>
             <w:r>
-              <w:t>All marketing requesters</w:t>
+              <w:t>CCID</w:t>
             </w:r>
           </w:p>
         </w:tc>
@@ -1166,7 +1166,7 @@
           </w:tcPr>
           <w:p>
             <w:r>
-              <w:t>REQ-CTT-WF-INT</w:t>
+              <w:t>Activity ID</w:t>
             </w:r>
           </w:p>
         </w:tc>
@@ -1176,7 +1176,7 @@
           </w:tcPr>
           <w:p>
             <w:r>
-              <w:t>Intake routing and common experience</w:t>
+              <w:t>Changes needed to support an Activity ID</w:t>
             </w:r>
           </w:p>
         </w:tc>
@@ -1188,7 +1188,7 @@
           </w:tcPr>
           <w:p>
             <w:r>
-              <w:t>Activity ID requesters</w:t>
+              <w:t>OID</w:t>
             </w:r>
           </w:p>
         </w:tc>
@@ -1198,7 +1198,7 @@
           </w:tcPr>
           <w:p>
             <w:r>
-              <w:t>REQ-CTT-WF-ACT</w:t>
+              <w:t>Offer ID</w:t>
             </w:r>
           </w:p>
         </w:tc>
@@ -1208,135 +1208,7 @@
           </w:tcPr>
           <w:p>
             <w:r>
-              <w:t>Activity ID (legacy CCID) standalone requests</w:t>
-            </w:r>
-          </w:p>
-        </w:tc>
-      </w:tr>
-      <w:tr>
-        <w:tc>
-          <w:tcPr>
-            <w:tcW w:type="dxa" w:w="3009"/>
-          </w:tcPr>
-          <w:p>
-            <w:r>
-              <w:t>Offer ID requesters</w:t>
-            </w:r>
-          </w:p>
-        </w:tc>
-        <w:tc>
-          <w:tcPr>
-            <w:tcW w:type="dxa" w:w="3009"/>
-          </w:tcPr>
-          <w:p>
-            <w:r>
-              <w:t>REQ-CTT-WF-OFR</w:t>
-            </w:r>
-          </w:p>
-        </w:tc>
-        <w:tc>
-          <w:tcPr>
-            <w:tcW w:type="dxa" w:w="3009"/>
-          </w:tcPr>
-          <w:p>
-            <w:r>
-              <w:t>Offer ID standalone requests — TO BE ADDED</w:t>
-            </w:r>
-          </w:p>
-        </w:tc>
-      </w:tr>
-      <w:tr>
-        <w:tc>
-          <w:tcPr>
-            <w:tcW w:type="dxa" w:w="3009"/>
-          </w:tcPr>
-          <w:p>
-            <w:r>
-              <w:t>Future Channel/Content ID</w:t>
-            </w:r>
-          </w:p>
-        </w:tc>
-        <w:tc>
-          <w:tcPr>
-            <w:tcW w:type="dxa" w:w="3009"/>
-          </w:tcPr>
-          <w:p>
-            <w:r>
-              <w:t>REQ-CTT-WF-CHC</w:t>
-            </w:r>
-          </w:p>
-        </w:tc>
-        <w:tc>
-          <w:tcPr>
-            <w:tcW w:type="dxa" w:w="3009"/>
-          </w:tcPr>
-          <w:p>
-            <w:r>
-              <w:t>Workfront-native IDs post-CTT decommission — see companion doc</w:t>
-            </w:r>
-          </w:p>
-        </w:tc>
-      </w:tr>
-      <w:tr>
-        <w:tc>
-          <w:tcPr>
-            <w:tcW w:type="dxa" w:w="3009"/>
-          </w:tcPr>
-          <w:p>
-            <w:r>
-              <w:t>Reporting / analytics</w:t>
-            </w:r>
-          </w:p>
-        </w:tc>
-        <w:tc>
-          <w:tcPr>
-            <w:tcW w:type="dxa" w:w="3009"/>
-          </w:tcPr>
-          <w:p>
-            <w:r>
-              <w:t>REQ-CTT-WF-RPT</w:t>
-            </w:r>
-          </w:p>
-        </w:tc>
-        <w:tc>
-          <w:tcPr>
-            <w:tcW w:type="dxa" w:w="3009"/>
-          </w:tcPr>
-          <w:p>
-            <w:r>
-              <w:t>Data quality and attribution</w:t>
-            </w:r>
-          </w:p>
-        </w:tc>
-      </w:tr>
-      <w:tr>
-        <w:tc>
-          <w:tcPr>
-            <w:tcW w:type="dxa" w:w="3009"/>
-          </w:tcPr>
-          <w:p>
-            <w:r>
-              <w:t>Platform / integration</w:t>
-            </w:r>
-          </w:p>
-        </w:tc>
-        <w:tc>
-          <w:tcPr>
-            <w:tcW w:type="dxa" w:w="3009"/>
-          </w:tcPr>
-          <w:p>
-            <w:r>
-              <w:t>REQ-CTT-WF-PLT</w:t>
-            </w:r>
-          </w:p>
-        </w:tc>
-        <w:tc>
-          <w:tcPr>
-            <w:tcW w:type="dxa" w:w="3009"/>
-          </w:tcPr>
-          <w:p>
-            <w:r>
-              <w:t>Decommission and downstream continuity</w:t>
+              <w:t>Changes needed to support an Offer ID</w:t>
             </w:r>
           </w:p>
         </w:tc>
@@ -1811,7 +1683,7 @@
           </w:tcPr>
           <w:p>
             <w:r>
-              <w:t>REQ-CTT-WF-ACT-001</w:t>
+              <w:t>CCID-001</w:t>
             </w:r>
           </w:p>
         </w:tc>
@@ -1853,7 +1725,7 @@
           </w:tcPr>
           <w:p>
             <w:r>
-              <w:t>REQ-CTT-WF-ACT-002</w:t>
+              <w:t>CCID-002</w:t>
             </w:r>
           </w:p>
         </w:tc>
@@ -1895,7 +1767,7 @@
           </w:tcPr>
           <w:p>
             <w:r>
-              <w:t>REQ-CTT-WF-ACT-003</w:t>
+              <w:t>CCID-003</w:t>
             </w:r>
           </w:p>
         </w:tc>
@@ -1937,7 +1809,7 @@
           </w:tcPr>
           <w:p>
             <w:r>
-              <w:t>REQ-CTT-WF-ACT-004</w:t>
+              <w:t>CCID-004</w:t>
             </w:r>
           </w:p>
         </w:tc>
@@ -1977,7 +1849,7 @@
           </w:tcPr>
           <w:p>
             <w:r>
-              <w:t>REQ-CTT-WF-ACT-005</w:t>
+              <w:t>CCID-005</w:t>
             </w:r>
           </w:p>
         </w:tc>
@@ -2017,7 +1889,7 @@
           </w:tcPr>
           <w:p>
             <w:r>
-              <w:t>REQ-CTT-WF-ACT-006</w:t>
+              <w:t>CCID-006</w:t>
             </w:r>
           </w:p>
         </w:tc>
@@ -2061,7 +1933,7 @@
     </w:p>
     <w:p>
       <w:r>
-        <w:t>[TO BE ADDED — Offer ID create, update, and bulk requirements will be documented in a subsequent BRD amendment or companion section. Cross-reference REQ-CTT-WF-OFR-* requirement IDs reserved.]</w:t>
+        <w:t>[TO BE ADDED — Offer ID create, update, and bulk requirements will be documented in a subsequent BRD amendment or companion section. Cross-reference OID-* requirement IDs reserved.]</w:t>
       </w:r>
     </w:p>
     <w:p>
@@ -2069,7 +1941,7 @@
         <w:pStyle w:val="ListBullet"/>
       </w:pPr>
       <w:r>
-        <w:t>Placeholder: REQ-CTT-WF-OFR-001 — Requesters must be able to create a new Offer ID with required strategic metadata. [Detail TBD]</w:t>
+        <w:t>Placeholder: OID-001 — Requesters must be able to create a new Offer ID with required strategic metadata. [Detail TBD]</w:t>
       </w:r>
     </w:p>
     <w:p>
@@ -2077,7 +1949,7 @@
         <w:pStyle w:val="ListBullet"/>
       </w:pPr>
       <w:r>
-        <w:t>Placeholder: REQ-CTT-WF-OFR-002 — Requesters must be able to update an existing Offer ID. [Detail TBD]</w:t>
+        <w:t>Placeholder: OID-002 — Requesters must be able to update an existing Offer ID. [Detail TBD]</w:t>
       </w:r>
     </w:p>
     <w:p>
@@ -2085,7 +1957,7 @@
         <w:pStyle w:val="ListBullet"/>
       </w:pPr>
       <w:r>
-        <w:t>Placeholder: REQ-CTT-WF-OFR-003 — Requesters must be able to submit bulk Offer ID requests. [Detail TBD]</w:t>
+        <w:t>Placeholder: OID-003 — Requesters must be able to submit bulk Offer ID requests. [Detail TBD]</w:t>
       </w:r>
     </w:p>
     <w:p>
@@ -2804,7 +2676,7 @@
           </w:tcPr>
           <w:p>
             <w:r>
-              <w:t>Section 4 — all REQ-CTT-WF-* (solution design out of scope for BRD)</w:t>
+              <w:t>Section 4 — all CCID-* and OID-* (solution design out of scope for BRD)</w:t>
             </w:r>
           </w:p>
         </w:tc>
@@ -2836,7 +2708,7 @@
           </w:tcPr>
           <w:p>
             <w:r>
-              <w:t>REQ-CTT-WF-ACT-002, REQ-CTT-WF-INT-008</w:t>
+              <w:t>CCID-002, REQ-CTT-WF-INT-008</w:t>
             </w:r>
           </w:p>
         </w:tc>
@@ -2900,7 +2772,7 @@
           </w:tcPr>
           <w:p>
             <w:r>
-              <w:t>REQ-CTT-WF-ACT-006, REQ-CTT-WF-RPT-003</w:t>
+              <w:t>CCID-006, REQ-CTT-WF-RPT-003</w:t>
             </w:r>
           </w:p>
         </w:tc>

</xml_diff>

<commit_message>
Replace section 4.1 with Activity ID user story requirements
Remove intake routing table and Activity ID summary section. Translate
What Do I Want Happen items into CCID user stories and renumber sections.

Co-authored-by: demodolly <demodolly@users.noreply.github.com>
</commit_message>
<xml_diff>
--- a/CTT Request Portal Decommission - Master BRD.docx
+++ b/CTT Request Portal Decommission - Master BRD.docx
@@ -1095,7 +1095,7 @@
     </w:p>
     <w:p>
       <w:r>
-        <w:t>Requirements are expressed as business needs. Requirement codes CCID and OID identify changes needed to support Activity ID and Offer ID respectively. Detailed Activity ID field logic is maintained in the companion document: "CTT Request Portal move to Workfront - Activity ID.docx". Offer ID and future Channel/Content ID requirements will be added via BRD amendment or companion documents.</w:t>
+        <w:t>Requirements are expressed as business needs using user story format. Requirement codes CCID and OID identify changes needed to support Activity ID and Offer ID respectively. Section 4.1 captures Activity ID requirements; Offer ID and future Channel/Content ID requirements will be added in subsequent sections or companion documents.</w:t>
       </w:r>
     </w:p>
     <w:p>
@@ -1219,7 +1219,205 @@
         <w:pStyle w:val="Heading2"/>
       </w:pPr>
       <w:r>
-        <w:t>4.1 Intake Routing &amp; Common Experience</w:t>
+        <w:t>4.1 Requirements</w:t>
+      </w:r>
+    </w:p>
+    <w:p>
+      <w:pPr/>
+      <w:r>
+        <w:t>The following requirements are expressed as user stories translated from the Activity ID intake needs. They describe what the business requires—not how the BCO should implement the capability in Workfront. Detailed campaign hierarchy validation matrices are maintained in the companion document: CTT Request Portal move to Workfront - Activity ID.docx.</w:t>
+      </w:r>
+    </w:p>
+    <w:p>
+      <w:pPr/>
+      <w:r/>
+    </w:p>
+    <w:p>
+      <w:pPr/>
+      <w:r>
+        <w:t>CCID-001: As a Marketing Manager, I want a supported intake path to request a Campaign Tagging and Tracking ID, so that I can obtain identifiers through the marketing operations workflow when the CTT Request Portal is decommissioned.</w:t>
+      </w:r>
+    </w:p>
+    <w:p>
+      <w:pPr/>
+      <w:r>
+        <w:t>CCID-002: As a Marketing Manager, I want to be asked whether I will create a Workfront marketing project for my initiative, so that I am directed to the correct process and can determine whether a standalone identifier request is required.</w:t>
+      </w:r>
+    </w:p>
+    <w:p>
+      <w:pPr/>
+      <w:r>
+        <w:t>CCID-003: As a Marketing Manager, I want to be informed that I do not need to manually request identifiers when I am creating a Workfront marketing project, so that I avoid duplicate requests and understand that identifiers will be generated during the project workflow.</w:t>
+      </w:r>
+    </w:p>
+    <w:p>
+      <w:pPr/>
+      <w:r>
+        <w:t>CCID-004: As a Marketing Manager, I want to continue with a standalone identifier request when I am not creating a Workfront marketing project, so that I can still obtain the IDs I need for my marketing activity.</w:t>
+      </w:r>
+    </w:p>
+    <w:p>
+      <w:pPr/>
+      <w:r>
+        <w:t>CCID-005: As a Marketing Manager, I want to indicate whether I need a legacy identifier (Activity ID or Offer ID) or a Workfront identifier (Channel ID or Content ID), so that I request the correct identifier type for my initiative during the hybrid tracking period.</w:t>
+      </w:r>
+    </w:p>
+    <w:p>
+      <w:pPr/>
+      <w:r>
+        <w:t>CCID-006: As a Marketing Manager, I want to select the legacy identifier type I need (Activity ID or Offer ID), so that I receive the correct ID for my tracking and reporting requirements.</w:t>
+      </w:r>
+    </w:p>
+    <w:p>
+      <w:pPr/>
+      <w:r>
+        <w:t>CCID-007: As a Marketing Manager, I want to be able to request the creation, update, or bulk submission of an Activity ID, so that I am able to generate and maintain marketing activities outside of a marketing initiative that is created in Workfront.</w:t>
+      </w:r>
+    </w:p>
+    <w:p>
+      <w:pPr/>
+      <w:r>
+        <w:t>CCID-008: As a Marketing Manager, I want to provide my CEC ID when requesting an Activity ID, so that the request is attributed to me for audit and follow-up purposes.</w:t>
+      </w:r>
+    </w:p>
+    <w:p>
+      <w:pPr/>
+      <w:r>
+        <w:t>CCID-009: As a Marketing Manager, I want to enter a name and description for my Activity ID, so that the identifier is meaningful and its purpose is understood in reporting and downstream systems.</w:t>
+      </w:r>
+    </w:p>
+    <w:p>
+      <w:pPr/>
+      <w:r>
+        <w:t>CCID-010: As a Marketing Manager, I want to specify start and end dates for my Activity ID, so that the activity period is accurately reflected in reporting and governance.</w:t>
+      </w:r>
+    </w:p>
+    <w:p>
+      <w:pPr/>
+      <w:r>
+        <w:t>CCID-011: As a Marketing Manager, I want to select a Campaign as the mandatory first step when requesting an Activity ID, so that my activity is aligned to the FY27 campaign hierarchy before any dependent fields are captured.</w:t>
+      </w:r>
+    </w:p>
+    <w:p>
+      <w:pPr/>
+      <w:r>
+        <w:t>CCID-012: As a Marketing Manager, I want to answer a maximum of two campaign hierarchy questions (Campaign plus either Program or Primary Technology, depending on the campaign selected), so that intake is efficient while still capturing complete strategic metadata.</w:t>
+      </w:r>
+    </w:p>
+    <w:p>
+      <w:pPr/>
+      <w:r>
+        <w:t>CCID-013: As a Marketing Manager, I want Program and/or Primary Technology to be auto-populated based on my Campaign selection where approved business rules apply, so that I provide accurate hierarchy data without unnecessary manual entry.</w:t>
+      </w:r>
+    </w:p>
+    <w:p>
+      <w:pPr/>
+      <w:r>
+        <w:t>CCID-014: As a Marketing Manager, I want to see auto-populated Program and Primary Technology values before I submit my request, so that I can confirm the system has assigned the correct hierarchy metadata.</w:t>
+      </w:r>
+    </w:p>
+    <w:p>
+      <w:pPr/>
+      <w:r>
+        <w:t>CCID-015: As a Marketing Manager, I want campaign hierarchy combinations to be validated against approved FY27 rules, so that invalid Campaign, Program, and Primary Technology combinations are rejected with a clear error message.</w:t>
+      </w:r>
+    </w:p>
+    <w:p>
+      <w:pPr/>
+      <w:r>
+        <w:t>CCID-016: As a Marketing Manager, I want bulk Activity ID requests to be validated using the same campaign hierarchy rules as single requests, so that I can efficiently create multiple identifiers without compromising data quality.</w:t>
+      </w:r>
+    </w:p>
+    <w:p>
+      <w:pPr/>
+      <w:r>
+        <w:t>CCID-017: As a Marketing Manager, I want dependent campaign hierarchy fields to be re-validated when I change the Campaign on an existing Activity ID, so that Program and Primary Technology remain consistent with FY27 rules.</w:t>
+      </w:r>
+    </w:p>
+    <w:p>
+      <w:pPr/>
+      <w:r>
+        <w:t>CCID-018: As a Marketing Manager, I want to select my Stakeholder Unit from an approved list, so that my Activity ID is attributed to the correct marketing organisation for reporting and governance.</w:t>
+      </w:r>
+    </w:p>
+    <w:p>
+      <w:pPr/>
+      <w:r>
+        <w:t>CCID-019: As a Marketing Manager, I want to select my Stakeholder from an approved list, so that my Activity ID reflects the team accountable for the marketing activity.</w:t>
+      </w:r>
+    </w:p>
+    <w:p>
+      <w:pPr/>
+      <w:r>
+        <w:t>CCID-020: As a Marketing Manager, I want to select the funnel stage for my Activity ID (Awareness, Consideration, Evaluation, or Decision), so that reporting can align the activity to the correct stage of the customer journey.</w:t>
+      </w:r>
+    </w:p>
+    <w:p>
+      <w:pPr/>
+      <w:r>
+        <w:t>CCID-021: As a Marketing Manager, I want to select the activity type for my Activity ID (Event, Webinar, or Driving Channel URL), so that Event and Webinar identifiers can be excluded from channel attribution double-counting where an Event ID or Offer ID already applies.</w:t>
+      </w:r>
+    </w:p>
+    <w:p>
+      <w:pPr/>
+      <w:r>
+        <w:t>CCID-022: As a Marketing Manager, I want to select the marketing initiative type (ABM, ABX, or Scale), so that my Activity ID aligns to the correct go-to-market approach for reporting.</w:t>
+      </w:r>
+    </w:p>
+    <w:p>
+      <w:pPr/>
+      <w:r>
+        <w:t>CCID-023: As a Marketing Manager, I want to select the region for my Activity ID (AMER, APJC, EMEA, or GLOBAL), so that geographic reporting and governance requirements are met.</w:t>
+      </w:r>
+    </w:p>
+    <w:p>
+      <w:pPr>
+        <w:pStyle w:val="Heading2"/>
+      </w:pPr>
+      <w:r>
+        <w:t>4.2 Offer ID Requirements</w:t>
+      </w:r>
+    </w:p>
+    <w:p>
+      <w:r>
+        <w:t>[TO BE ADDED — Offer ID create, update, and bulk requirements will be documented in a subsequent BRD amendment or companion section. Cross-reference OID-* requirement IDs reserved.]</w:t>
+      </w:r>
+    </w:p>
+    <w:p>
+      <w:pPr>
+        <w:pStyle w:val="ListBullet"/>
+      </w:pPr>
+      <w:r>
+        <w:t>Placeholder: OID-001 — Requesters must be able to create a new Offer ID with required strategic metadata. [Detail TBD]</w:t>
+      </w:r>
+    </w:p>
+    <w:p>
+      <w:pPr>
+        <w:pStyle w:val="ListBullet"/>
+      </w:pPr>
+      <w:r>
+        <w:t>Placeholder: OID-002 — Requesters must be able to update an existing Offer ID. [Detail TBD]</w:t>
+      </w:r>
+    </w:p>
+    <w:p>
+      <w:pPr>
+        <w:pStyle w:val="ListBullet"/>
+      </w:pPr>
+      <w:r>
+        <w:t>Placeholder: OID-003 — Requesters must be able to submit bulk Offer ID requests. [Detail TBD]</w:t>
+      </w:r>
+    </w:p>
+    <w:p>
+      <w:pPr>
+        <w:pStyle w:val="Heading2"/>
+      </w:pPr>
+      <w:r>
+        <w:t>4.3 Future State — Workfront Channel &amp; Content IDs</w:t>
+      </w:r>
+    </w:p>
+    <w:p>
+      <w:r>
+        <w:t>When the CTT Tool is decommissioned, the business will rely on Workfront-native Channel and Content IDs instead of legacy Activity and Offer IDs. This Master BRD establishes the following future-proofing requirement; detailed requirements will be documented separately to avoid conflating hybrid-period and target-state scope.</w:t>
       </w:r>
     </w:p>
     <w:tbl>
@@ -1283,7 +1481,7 @@
           </w:tcPr>
           <w:p>
             <w:r>
-              <w:t>REQ-CTT-WF-INT-001</w:t>
+              <w:t>REQ-CTT-WF-CHC-001</w:t>
             </w:r>
           </w:p>
         </w:tc>
@@ -1293,7 +1491,7 @@
           </w:tcPr>
           <w:p>
             <w:r>
-              <w:t>The business must provide a single supported intake path for Campaign Tagging and Tracking identifier requests that replaces the CTT Request Portal.</w:t>
+              <w:t>The intake capability relocated from the CTT Request Portal must be extensible to support standalone Channel ID and Content ID requests without dependency on the CTT Tool.</w:t>
             </w:r>
           </w:p>
         </w:tc>
@@ -1313,7 +1511,7 @@
           </w:tcPr>
           <w:p>
             <w:r>
-              <w:t>Does not prescribe Workfront form vs. task vs. other BCO-owned pattern.</w:t>
+              <w:t>Detailed requirements: separate companion document [TBD].</w:t>
             </w:r>
           </w:p>
         </w:tc>
@@ -1325,7 +1523,7 @@
           </w:tcPr>
           <w:p>
             <w:r>
-              <w:t>REQ-CTT-WF-INT-002</w:t>
+              <w:t>REQ-CTT-WF-CHC-002</w:t>
             </w:r>
           </w:p>
         </w:tc>
@@ -1335,7 +1533,7 @@
           </w:tcPr>
           <w:p>
             <w:r>
-              <w:t>The intake experience must determine whether the requester intends to create a Workfront marketing project for their initiative.</w:t>
+              <w:t>Future Channel/Content ID intake must capture equivalent strategic metadata needed for reporting and governance parity with legacy identifiers.</w:t>
             </w:r>
           </w:p>
         </w:tc>
@@ -1345,7 +1543,7 @@
           </w:tcPr>
           <w:p>
             <w:r>
-              <w:t>Must Have</w:t>
+              <w:t>Should Have</w:t>
             </w:r>
           </w:p>
         </w:tc>
@@ -1355,7 +1553,7 @@
           </w:tcPr>
           <w:p>
             <w:r>
-              <w:t>Decision point only; implementation at BCO discretion.</w:t>
+              <w:t>Metadata mapping TBD in future-state doc.</w:t>
             </w:r>
           </w:p>
         </w:tc>
@@ -1367,7 +1565,7 @@
           </w:tcPr>
           <w:p>
             <w:r>
-              <w:t>REQ-CTT-WF-INT-003</w:t>
+              <w:t>REQ-CTT-WF-CHC-003</w:t>
             </w:r>
           </w:p>
         </w:tc>
@@ -1377,7 +1575,7 @@
           </w:tcPr>
           <w:p>
             <w:r>
-              <w:t>When the requester indicates they will create a Workfront marketing project, the business must inform them that identifiers will be generated through the project workflow and a standalone request is not required.</w:t>
+              <w:t>The business must maintain a documented transition plan from legacy to Workfront-native identifiers, including dual-running period if required.</w:t>
             </w:r>
           </w:p>
         </w:tc>
@@ -1397,213 +1595,7 @@
           </w:tcPr>
           <w:p>
             <w:r>
-              <w:t>Messaging requirement only.</w:t>
-            </w:r>
-          </w:p>
-        </w:tc>
-      </w:tr>
-      <w:tr>
-        <w:tc>
-          <w:tcPr>
-            <w:tcW w:type="dxa" w:w="2256"/>
-          </w:tcPr>
-          <w:p>
-            <w:r>
-              <w:t>REQ-CTT-WF-INT-004</w:t>
-            </w:r>
-          </w:p>
-        </w:tc>
-        <w:tc>
-          <w:tcPr>
-            <w:tcW w:type="dxa" w:w="2256"/>
-          </w:tcPr>
-          <w:p>
-            <w:r>
-              <w:t>When the requester indicates they will not create a Workfront marketing project, the business must allow them to proceed with a standalone identifier request.</w:t>
-            </w:r>
-          </w:p>
-        </w:tc>
-        <w:tc>
-          <w:tcPr>
-            <w:tcW w:type="dxa" w:w="2256"/>
-          </w:tcPr>
-          <w:p>
-            <w:r>
-              <w:t>Must Have</w:t>
-            </w:r>
-          </w:p>
-        </w:tc>
-        <w:tc>
-          <w:tcPr>
-            <w:tcW w:type="dxa" w:w="2256"/>
-          </w:tcPr>
-          <w:p>
-            <w:r/>
-          </w:p>
-        </w:tc>
-      </w:tr>
-      <w:tr>
-        <w:tc>
-          <w:tcPr>
-            <w:tcW w:type="dxa" w:w="2256"/>
-          </w:tcPr>
-          <w:p>
-            <w:r>
-              <w:t>REQ-CTT-WF-INT-005</w:t>
-            </w:r>
-          </w:p>
-        </w:tc>
-        <w:tc>
-          <w:tcPr>
-            <w:tcW w:type="dxa" w:w="2256"/>
-          </w:tcPr>
-          <w:p>
-            <w:r>
-              <w:t>The intake experience must allow the requester to indicate whether they need a legacy identifier (Activity ID or Offer ID) or a Workfront-native identifier (Channel ID or Content ID).</w:t>
-            </w:r>
-          </w:p>
-        </w:tc>
-        <w:tc>
-          <w:tcPr>
-            <w:tcW w:type="dxa" w:w="2256"/>
-          </w:tcPr>
-          <w:p>
-            <w:r>
-              <w:t>Must Have</w:t>
-            </w:r>
-          </w:p>
-        </w:tc>
-        <w:tc>
-          <w:tcPr>
-            <w:tcW w:type="dxa" w:w="2256"/>
-          </w:tcPr>
-          <w:p>
-            <w:r>
-              <w:t>Channel/Content path detailed in future companion document.</w:t>
-            </w:r>
-          </w:p>
-        </w:tc>
-      </w:tr>
-      <w:tr>
-        <w:tc>
-          <w:tcPr>
-            <w:tcW w:type="dxa" w:w="2256"/>
-          </w:tcPr>
-          <w:p>
-            <w:r>
-              <w:t>REQ-CTT-WF-INT-006</w:t>
-            </w:r>
-          </w:p>
-        </w:tc>
-        <w:tc>
-          <w:tcPr>
-            <w:tcW w:type="dxa" w:w="2256"/>
-          </w:tcPr>
-          <w:p>
-            <w:r>
-              <w:t>The intake experience must support Create, Update, and Bulk request actions for applicable identifier types.</w:t>
-            </w:r>
-          </w:p>
-        </w:tc>
-        <w:tc>
-          <w:tcPr>
-            <w:tcW w:type="dxa" w:w="2256"/>
-          </w:tcPr>
-          <w:p>
-            <w:r>
-              <w:t>Must Have</w:t>
-            </w:r>
-          </w:p>
-        </w:tc>
-        <w:tc>
-          <w:tcPr>
-            <w:tcW w:type="dxa" w:w="2256"/>
-          </w:tcPr>
-          <w:p>
-            <w:r>
-              <w:t>Bulk validation rules must match single-request business rules.</w:t>
-            </w:r>
-          </w:p>
-        </w:tc>
-      </w:tr>
-      <w:tr>
-        <w:tc>
-          <w:tcPr>
-            <w:tcW w:type="dxa" w:w="2256"/>
-          </w:tcPr>
-          <w:p>
-            <w:r>
-              <w:t>REQ-CTT-WF-INT-007</w:t>
-            </w:r>
-          </w:p>
-        </w:tc>
-        <w:tc>
-          <w:tcPr>
-            <w:tcW w:type="dxa" w:w="2256"/>
-          </w:tcPr>
-          <w:p>
-            <w:r>
-              <w:t>The business must capture the requester's CEC ID for all standalone requests for audit and contact purposes.</w:t>
-            </w:r>
-          </w:p>
-        </w:tc>
-        <w:tc>
-          <w:tcPr>
-            <w:tcW w:type="dxa" w:w="2256"/>
-          </w:tcPr>
-          <w:p>
-            <w:r>
-              <w:t>Must Have</w:t>
-            </w:r>
-          </w:p>
-        </w:tc>
-        <w:tc>
-          <w:tcPr>
-            <w:tcW w:type="dxa" w:w="2256"/>
-          </w:tcPr>
-          <w:p>
-            <w:r/>
-          </w:p>
-        </w:tc>
-      </w:tr>
-      <w:tr>
-        <w:tc>
-          <w:tcPr>
-            <w:tcW w:type="dxa" w:w="2256"/>
-          </w:tcPr>
-          <w:p>
-            <w:r>
-              <w:t>REQ-CTT-WF-INT-008</w:t>
-            </w:r>
-          </w:p>
-        </w:tc>
-        <w:tc>
-          <w:tcPr>
-            <w:tcW w:type="dxa" w:w="2256"/>
-          </w:tcPr>
-          <w:p>
-            <w:r>
-              <w:t>The business must capture Stakeholder Unit, Stakeholder, Funnel Stage, Marketing Initiative, and Region for standalone requests as defined in governance lists.</w:t>
-            </w:r>
-          </w:p>
-        </w:tc>
-        <w:tc>
-          <w:tcPr>
-            <w:tcW w:type="dxa" w:w="2256"/>
-          </w:tcPr>
-          <w:p>
-            <w:r>
-              <w:t>Must Have</w:t>
-            </w:r>
-          </w:p>
-        </w:tc>
-        <w:tc>
-          <w:tcPr>
-            <w:tcW w:type="dxa" w:w="2256"/>
-          </w:tcPr>
-          <w:p>
-            <w:r>
-              <w:t>Reference lists maintained by business owners.</w:t>
+              <w:t>Programme dependency outside this BRD scope.</w:t>
             </w:r>
           </w:p>
         </w:tc>
@@ -1614,12 +1606,7 @@
         <w:pStyle w:val="Heading2"/>
       </w:pPr>
       <w:r>
-        <w:t>4.2 Activity ID Requirements (Summary)</w:t>
-      </w:r>
-    </w:p>
-    <w:p>
-      <w:r>
-        <w:t>Full field-level requirements, conditional campaign hierarchy logic (Paths A/B/C), validation matrices, and bulk/update rules are documented in: CTT Request Portal move to Workfront - Activity ID.docx. The following summarises business requirements at Master BRD level.</w:t>
+        <w:t>4.4 Reporting &amp; Data Quality</w:t>
       </w:r>
     </w:p>
     <w:tbl>
@@ -1683,7 +1670,7 @@
           </w:tcPr>
           <w:p>
             <w:r>
-              <w:t>CCID-001</w:t>
+              <w:t>REQ-CTT-WF-RPT-001</w:t>
             </w:r>
           </w:p>
         </w:tc>
@@ -1693,7 +1680,7 @@
           </w:tcPr>
           <w:p>
             <w:r>
-              <w:t>Requesters must be able to create a new Activity ID with name, description, start date, and end date.</w:t>
+              <w:t>All standalone identifier requests must capture mandatory strategic metadata before identifier generation is complete.</w:t>
             </w:r>
           </w:p>
         </w:tc>
@@ -1712,9 +1699,7 @@
             <w:tcW w:type="dxa" w:w="2256"/>
           </w:tcPr>
           <w:p>
-            <w:r>
-              <w:t>Detail in Activity ID companion doc.</w:t>
-            </w:r>
+            <w:r/>
           </w:p>
         </w:tc>
       </w:tr>
@@ -1725,7 +1710,7 @@
           </w:tcPr>
           <w:p>
             <w:r>
-              <w:t>CCID-002</w:t>
+              <w:t>REQ-CTT-WF-RPT-002</w:t>
             </w:r>
           </w:p>
         </w:tc>
@@ -1735,7 +1720,7 @@
           </w:tcPr>
           <w:p>
             <w:r>
-              <w:t>Activity ID requests must capture Campaign, Program, and Primary Technology according to approved hierarchy validation rules.</w:t>
+              <w:t>Activity IDs with Activity Type Event or Webinar must be identifiable in downstream systems for attribution exclusion from channel double-counting.</w:t>
             </w:r>
           </w:p>
         </w:tc>
@@ -1754,9 +1739,7 @@
             <w:tcW w:type="dxa" w:w="2256"/>
           </w:tcPr>
           <w:p>
-            <w:r>
-              <w:t>Paths A/B/C matrices in companion doc.</w:t>
-            </w:r>
+            <w:r/>
           </w:p>
         </w:tc>
       </w:tr>
@@ -1767,7 +1750,7 @@
           </w:tcPr>
           <w:p>
             <w:r>
-              <w:t>CCID-003</w:t>
+              <w:t>REQ-CTT-WF-RPT-003</w:t>
             </w:r>
           </w:p>
         </w:tc>
@@ -1777,129 +1760,7 @@
           </w:tcPr>
           <w:p>
             <w:r>
-              <w:t>Requesters must select Activity Type (Event, Webinar, Driving Channel URL) to support correct attribution treatment.</w:t>
-            </w:r>
-          </w:p>
-        </w:tc>
-        <w:tc>
-          <w:tcPr>
-            <w:tcW w:type="dxa" w:w="2256"/>
-          </w:tcPr>
-          <w:p>
-            <w:r>
-              <w:t>Must Have</w:t>
-            </w:r>
-          </w:p>
-        </w:tc>
-        <w:tc>
-          <w:tcPr>
-            <w:tcW w:type="dxa" w:w="2256"/>
-          </w:tcPr>
-          <w:p>
-            <w:r>
-              <w:t>Event/Webinar must be excludable from channel attribution double-count.</w:t>
-            </w:r>
-          </w:p>
-        </w:tc>
-      </w:tr>
-      <w:tr>
-        <w:tc>
-          <w:tcPr>
-            <w:tcW w:type="dxa" w:w="2256"/>
-          </w:tcPr>
-          <w:p>
-            <w:r>
-              <w:t>CCID-004</w:t>
-            </w:r>
-          </w:p>
-        </w:tc>
-        <w:tc>
-          <w:tcPr>
-            <w:tcW w:type="dxa" w:w="2256"/>
-          </w:tcPr>
-          <w:p>
-            <w:r>
-              <w:t>Requesters must be able to update an existing Activity ID; changes to Campaign must re-apply hierarchy validation.</w:t>
-            </w:r>
-          </w:p>
-        </w:tc>
-        <w:tc>
-          <w:tcPr>
-            <w:tcW w:type="dxa" w:w="2256"/>
-          </w:tcPr>
-          <w:p>
-            <w:r>
-              <w:t>Must Have</w:t>
-            </w:r>
-          </w:p>
-        </w:tc>
-        <w:tc>
-          <w:tcPr>
-            <w:tcW w:type="dxa" w:w="2256"/>
-          </w:tcPr>
-          <w:p>
-            <w:r/>
-          </w:p>
-        </w:tc>
-      </w:tr>
-      <w:tr>
-        <w:tc>
-          <w:tcPr>
-            <w:tcW w:type="dxa" w:w="2256"/>
-          </w:tcPr>
-          <w:p>
-            <w:r>
-              <w:t>CCID-005</w:t>
-            </w:r>
-          </w:p>
-        </w:tc>
-        <w:tc>
-          <w:tcPr>
-            <w:tcW w:type="dxa" w:w="2256"/>
-          </w:tcPr>
-          <w:p>
-            <w:r>
-              <w:t>Requesters must be able to submit bulk Activity ID requests with the same validation rules as single requests.</w:t>
-            </w:r>
-          </w:p>
-        </w:tc>
-        <w:tc>
-          <w:tcPr>
-            <w:tcW w:type="dxa" w:w="2256"/>
-          </w:tcPr>
-          <w:p>
-            <w:r>
-              <w:t>Must Have</w:t>
-            </w:r>
-          </w:p>
-        </w:tc>
-        <w:tc>
-          <w:tcPr>
-            <w:tcW w:type="dxa" w:w="2256"/>
-          </w:tcPr>
-          <w:p>
-            <w:r/>
-          </w:p>
-        </w:tc>
-      </w:tr>
-      <w:tr>
-        <w:tc>
-          <w:tcPr>
-            <w:tcW w:type="dxa" w:w="2256"/>
-          </w:tcPr>
-          <w:p>
-            <w:r>
-              <w:t>CCID-006</w:t>
-            </w:r>
-          </w:p>
-        </w:tc>
-        <w:tc>
-          <w:tcPr>
-            <w:tcW w:type="dxa" w:w="2256"/>
-          </w:tcPr>
-          <w:p>
-            <w:r>
-              <w:t>Created Activity IDs must be persisted and made available to downstream reporting systems (OMS) without manual intervention.</w:t>
+              <w:t>Identifier and metadata records must continue to flow to OMS/reporting with no data loss during portal decommission and intake migration.</w:t>
             </w:r>
           </w:p>
         </w:tc>
@@ -1928,49 +1789,7 @@
         <w:pStyle w:val="Heading2"/>
       </w:pPr>
       <w:r>
-        <w:t>4.3 Offer ID Requirements</w:t>
-      </w:r>
-    </w:p>
-    <w:p>
-      <w:r>
-        <w:t>[TO BE ADDED — Offer ID create, update, and bulk requirements will be documented in a subsequent BRD amendment or companion section. Cross-reference OID-* requirement IDs reserved.]</w:t>
-      </w:r>
-    </w:p>
-    <w:p>
-      <w:pPr>
-        <w:pStyle w:val="ListBullet"/>
-      </w:pPr>
-      <w:r>
-        <w:t>Placeholder: OID-001 — Requesters must be able to create a new Offer ID with required strategic metadata. [Detail TBD]</w:t>
-      </w:r>
-    </w:p>
-    <w:p>
-      <w:pPr>
-        <w:pStyle w:val="ListBullet"/>
-      </w:pPr>
-      <w:r>
-        <w:t>Placeholder: OID-002 — Requesters must be able to update an existing Offer ID. [Detail TBD]</w:t>
-      </w:r>
-    </w:p>
-    <w:p>
-      <w:pPr>
-        <w:pStyle w:val="ListBullet"/>
-      </w:pPr>
-      <w:r>
-        <w:t>Placeholder: OID-003 — Requesters must be able to submit bulk Offer ID requests. [Detail TBD]</w:t>
-      </w:r>
-    </w:p>
-    <w:p>
-      <w:pPr>
-        <w:pStyle w:val="Heading2"/>
-      </w:pPr>
-      <w:r>
-        <w:t>4.4 Future State — Workfront Channel &amp; Content IDs</w:t>
-      </w:r>
-    </w:p>
-    <w:p>
-      <w:r>
-        <w:t>When the CTT Tool is decommissioned, the business will rely on Workfront-native Channel and Content IDs instead of legacy Activity and Offer IDs. This Master BRD establishes the following future-proofing requirement; detailed requirements will be documented separately to avoid conflating hybrid-period and target-state scope.</w:t>
+        <w:t>4.5 Platform Decommission &amp; Transition</w:t>
       </w:r>
     </w:p>
     <w:tbl>
@@ -2034,378 +1853,6 @@
           </w:tcPr>
           <w:p>
             <w:r>
-              <w:t>REQ-CTT-WF-CHC-001</w:t>
-            </w:r>
-          </w:p>
-        </w:tc>
-        <w:tc>
-          <w:tcPr>
-            <w:tcW w:type="dxa" w:w="2256"/>
-          </w:tcPr>
-          <w:p>
-            <w:r>
-              <w:t>The intake capability relocated from the CTT Request Portal must be extensible to support standalone Channel ID and Content ID requests without dependency on the CTT Tool.</w:t>
-            </w:r>
-          </w:p>
-        </w:tc>
-        <w:tc>
-          <w:tcPr>
-            <w:tcW w:type="dxa" w:w="2256"/>
-          </w:tcPr>
-          <w:p>
-            <w:r>
-              <w:t>Must Have</w:t>
-            </w:r>
-          </w:p>
-        </w:tc>
-        <w:tc>
-          <w:tcPr>
-            <w:tcW w:type="dxa" w:w="2256"/>
-          </w:tcPr>
-          <w:p>
-            <w:r>
-              <w:t>Detailed requirements: separate companion document [TBD].</w:t>
-            </w:r>
-          </w:p>
-        </w:tc>
-      </w:tr>
-      <w:tr>
-        <w:tc>
-          <w:tcPr>
-            <w:tcW w:type="dxa" w:w="2256"/>
-          </w:tcPr>
-          <w:p>
-            <w:r>
-              <w:t>REQ-CTT-WF-CHC-002</w:t>
-            </w:r>
-          </w:p>
-        </w:tc>
-        <w:tc>
-          <w:tcPr>
-            <w:tcW w:type="dxa" w:w="2256"/>
-          </w:tcPr>
-          <w:p>
-            <w:r>
-              <w:t>Future Channel/Content ID intake must capture equivalent strategic metadata needed for reporting and governance parity with legacy identifiers.</w:t>
-            </w:r>
-          </w:p>
-        </w:tc>
-        <w:tc>
-          <w:tcPr>
-            <w:tcW w:type="dxa" w:w="2256"/>
-          </w:tcPr>
-          <w:p>
-            <w:r>
-              <w:t>Should Have</w:t>
-            </w:r>
-          </w:p>
-        </w:tc>
-        <w:tc>
-          <w:tcPr>
-            <w:tcW w:type="dxa" w:w="2256"/>
-          </w:tcPr>
-          <w:p>
-            <w:r>
-              <w:t>Metadata mapping TBD in future-state doc.</w:t>
-            </w:r>
-          </w:p>
-        </w:tc>
-      </w:tr>
-      <w:tr>
-        <w:tc>
-          <w:tcPr>
-            <w:tcW w:type="dxa" w:w="2256"/>
-          </w:tcPr>
-          <w:p>
-            <w:r>
-              <w:t>REQ-CTT-WF-CHC-003</w:t>
-            </w:r>
-          </w:p>
-        </w:tc>
-        <w:tc>
-          <w:tcPr>
-            <w:tcW w:type="dxa" w:w="2256"/>
-          </w:tcPr>
-          <w:p>
-            <w:r>
-              <w:t>The business must maintain a documented transition plan from legacy to Workfront-native identifiers, including dual-running period if required.</w:t>
-            </w:r>
-          </w:p>
-        </w:tc>
-        <w:tc>
-          <w:tcPr>
-            <w:tcW w:type="dxa" w:w="2256"/>
-          </w:tcPr>
-          <w:p>
-            <w:r>
-              <w:t>Must Have</w:t>
-            </w:r>
-          </w:p>
-        </w:tc>
-        <w:tc>
-          <w:tcPr>
-            <w:tcW w:type="dxa" w:w="2256"/>
-          </w:tcPr>
-          <w:p>
-            <w:r>
-              <w:t>Programme dependency outside this BRD scope.</w:t>
-            </w:r>
-          </w:p>
-        </w:tc>
-      </w:tr>
-    </w:tbl>
-    <w:p>
-      <w:pPr>
-        <w:pStyle w:val="Heading2"/>
-      </w:pPr>
-      <w:r>
-        <w:t>4.5 Reporting &amp; Data Quality</w:t>
-      </w:r>
-    </w:p>
-    <w:tbl>
-      <w:tblPr>
-        <w:tblStyle w:val="TableGrid"/>
-        <w:tblW w:type="auto" w:w="0"/>
-        <w:tblLook w:firstColumn="1" w:firstRow="1" w:lastColumn="0" w:lastRow="0" w:noHBand="0" w:noVBand="1" w:val="04A0"/>
-      </w:tblPr>
-      <w:tblGrid>
-        <w:gridCol w:w="2256"/>
-        <w:gridCol w:w="2256"/>
-        <w:gridCol w:w="2256"/>
-        <w:gridCol w:w="2256"/>
-      </w:tblGrid>
-      <w:tr>
-        <w:tc>
-          <w:tcPr>
-            <w:tcW w:type="dxa" w:w="2256"/>
-          </w:tcPr>
-          <w:p>
-            <w:r>
-              <w:t>Req ID</w:t>
-            </w:r>
-          </w:p>
-        </w:tc>
-        <w:tc>
-          <w:tcPr>
-            <w:tcW w:type="dxa" w:w="2256"/>
-          </w:tcPr>
-          <w:p>
-            <w:r>
-              <w:t>Requirement</w:t>
-            </w:r>
-          </w:p>
-        </w:tc>
-        <w:tc>
-          <w:tcPr>
-            <w:tcW w:type="dxa" w:w="2256"/>
-          </w:tcPr>
-          <w:p>
-            <w:r>
-              <w:t>Priority</w:t>
-            </w:r>
-          </w:p>
-        </w:tc>
-        <w:tc>
-          <w:tcPr>
-            <w:tcW w:type="dxa" w:w="2256"/>
-          </w:tcPr>
-          <w:p>
-            <w:r>
-              <w:t>Notes</w:t>
-            </w:r>
-          </w:p>
-        </w:tc>
-      </w:tr>
-      <w:tr>
-        <w:tc>
-          <w:tcPr>
-            <w:tcW w:type="dxa" w:w="2256"/>
-          </w:tcPr>
-          <w:p>
-            <w:r>
-              <w:t>REQ-CTT-WF-RPT-001</w:t>
-            </w:r>
-          </w:p>
-        </w:tc>
-        <w:tc>
-          <w:tcPr>
-            <w:tcW w:type="dxa" w:w="2256"/>
-          </w:tcPr>
-          <w:p>
-            <w:r>
-              <w:t>All standalone identifier requests must capture mandatory strategic metadata before identifier generation is complete.</w:t>
-            </w:r>
-          </w:p>
-        </w:tc>
-        <w:tc>
-          <w:tcPr>
-            <w:tcW w:type="dxa" w:w="2256"/>
-          </w:tcPr>
-          <w:p>
-            <w:r>
-              <w:t>Must Have</w:t>
-            </w:r>
-          </w:p>
-        </w:tc>
-        <w:tc>
-          <w:tcPr>
-            <w:tcW w:type="dxa" w:w="2256"/>
-          </w:tcPr>
-          <w:p>
-            <w:r/>
-          </w:p>
-        </w:tc>
-      </w:tr>
-      <w:tr>
-        <w:tc>
-          <w:tcPr>
-            <w:tcW w:type="dxa" w:w="2256"/>
-          </w:tcPr>
-          <w:p>
-            <w:r>
-              <w:t>REQ-CTT-WF-RPT-002</w:t>
-            </w:r>
-          </w:p>
-        </w:tc>
-        <w:tc>
-          <w:tcPr>
-            <w:tcW w:type="dxa" w:w="2256"/>
-          </w:tcPr>
-          <w:p>
-            <w:r>
-              <w:t>Activity IDs with Activity Type Event or Webinar must be identifiable in downstream systems for attribution exclusion from channel double-counting.</w:t>
-            </w:r>
-          </w:p>
-        </w:tc>
-        <w:tc>
-          <w:tcPr>
-            <w:tcW w:type="dxa" w:w="2256"/>
-          </w:tcPr>
-          <w:p>
-            <w:r>
-              <w:t>Must Have</w:t>
-            </w:r>
-          </w:p>
-        </w:tc>
-        <w:tc>
-          <w:tcPr>
-            <w:tcW w:type="dxa" w:w="2256"/>
-          </w:tcPr>
-          <w:p>
-            <w:r/>
-          </w:p>
-        </w:tc>
-      </w:tr>
-      <w:tr>
-        <w:tc>
-          <w:tcPr>
-            <w:tcW w:type="dxa" w:w="2256"/>
-          </w:tcPr>
-          <w:p>
-            <w:r>
-              <w:t>REQ-CTT-WF-RPT-003</w:t>
-            </w:r>
-          </w:p>
-        </w:tc>
-        <w:tc>
-          <w:tcPr>
-            <w:tcW w:type="dxa" w:w="2256"/>
-          </w:tcPr>
-          <w:p>
-            <w:r>
-              <w:t>Identifier and metadata records must continue to flow to OMS/reporting with no data loss during portal decommission and intake migration.</w:t>
-            </w:r>
-          </w:p>
-        </w:tc>
-        <w:tc>
-          <w:tcPr>
-            <w:tcW w:type="dxa" w:w="2256"/>
-          </w:tcPr>
-          <w:p>
-            <w:r>
-              <w:t>Must Have</w:t>
-            </w:r>
-          </w:p>
-        </w:tc>
-        <w:tc>
-          <w:tcPr>
-            <w:tcW w:type="dxa" w:w="2256"/>
-          </w:tcPr>
-          <w:p>
-            <w:r/>
-          </w:p>
-        </w:tc>
-      </w:tr>
-    </w:tbl>
-    <w:p>
-      <w:pPr>
-        <w:pStyle w:val="Heading2"/>
-      </w:pPr>
-      <w:r>
-        <w:t>4.6 Platform Decommission &amp; Transition</w:t>
-      </w:r>
-    </w:p>
-    <w:tbl>
-      <w:tblPr>
-        <w:tblStyle w:val="TableGrid"/>
-        <w:tblW w:type="auto" w:w="0"/>
-        <w:tblLook w:firstColumn="1" w:firstRow="1" w:lastColumn="0" w:lastRow="0" w:noHBand="0" w:noVBand="1" w:val="04A0"/>
-      </w:tblPr>
-      <w:tblGrid>
-        <w:gridCol w:w="2256"/>
-        <w:gridCol w:w="2256"/>
-        <w:gridCol w:w="2256"/>
-        <w:gridCol w:w="2256"/>
-      </w:tblGrid>
-      <w:tr>
-        <w:tc>
-          <w:tcPr>
-            <w:tcW w:type="dxa" w:w="2256"/>
-          </w:tcPr>
-          <w:p>
-            <w:r>
-              <w:t>Req ID</w:t>
-            </w:r>
-          </w:p>
-        </w:tc>
-        <w:tc>
-          <w:tcPr>
-            <w:tcW w:type="dxa" w:w="2256"/>
-          </w:tcPr>
-          <w:p>
-            <w:r>
-              <w:t>Requirement</w:t>
-            </w:r>
-          </w:p>
-        </w:tc>
-        <w:tc>
-          <w:tcPr>
-            <w:tcW w:type="dxa" w:w="2256"/>
-          </w:tcPr>
-          <w:p>
-            <w:r>
-              <w:t>Priority</w:t>
-            </w:r>
-          </w:p>
-        </w:tc>
-        <w:tc>
-          <w:tcPr>
-            <w:tcW w:type="dxa" w:w="2256"/>
-          </w:tcPr>
-          <w:p>
-            <w:r>
-              <w:t>Notes</w:t>
-            </w:r>
-          </w:p>
-        </w:tc>
-      </w:tr>
-      <w:tr>
-        <w:tc>
-          <w:tcPr>
-            <w:tcW w:type="dxa" w:w="2256"/>
-          </w:tcPr>
-          <w:p>
-            <w:r>
               <w:t>REQ-CTT-WF-PLT-001</w:t>
             </w:r>
           </w:p>
@@ -2708,7 +2155,7 @@
           </w:tcPr>
           <w:p>
             <w:r>
-              <w:t>CCID-002, REQ-CTT-WF-INT-008</w:t>
+              <w:t>CCID-011 to CCID-017</w:t>
             </w:r>
           </w:p>
         </w:tc>
@@ -2772,7 +2219,7 @@
           </w:tcPr>
           <w:p>
             <w:r>
-              <w:t>CCID-006, REQ-CTT-WF-RPT-003</w:t>
+              <w:t>CCID-007, REQ-CTT-WF-RPT-003</w:t>
             </w:r>
           </w:p>
         </w:tc>
@@ -2836,7 +2283,7 @@
           </w:tcPr>
           <w:p>
             <w:r>
-              <w:t>Sections 4.3, 4.4</w:t>
+              <w:t>Sections 4.2, 4.3</w:t>
             </w:r>
           </w:p>
         </w:tc>

</xml_diff>